<commit_message>
Updating talks and other
</commit_message>
<xml_diff>
--- a/resume.docx
+++ b/resume.docx
@@ -59,30 +59,48 @@
           <w:sz w:val="20"/>
           <w:szCs w:val="20"/>
         </w:rPr>
-        <w:t>, UT, 84094</w:t>
-      </w:r>
-    </w:p>
-    <w:p>
+        <w:t>, UT, 840</w:t>
+      </w:r>
+      <w:r>
+        <w:rPr>
+          <w:color w:val="333333"/>
+          <w:sz w:val="20"/>
+          <w:szCs w:val="20"/>
+        </w:rPr>
+        <w:t>09</w:t>
+      </w:r>
+    </w:p>
+    <w:p>
+      <w:r>
+        <w:fldChar w:fldCharType="begin"/>
+      </w:r>
+      <w:r>
+        <w:instrText>HYPERLINK "https://ggv.cl/" \h</w:instrText>
+      </w:r>
+      <w:r>
+        <w:fldChar w:fldCharType="separate"/>
+      </w:r>
+      <w:r>
+        <w:rPr>
+          <w:color w:val="333333"/>
+          <w:sz w:val="20"/>
+          <w:szCs w:val="20"/>
+          <w:u w:val="single"/>
+        </w:rPr>
+        <w:t>https://ggv.cl</w:t>
+      </w:r>
+      <w:r>
+        <w:fldChar w:fldCharType="end"/>
+      </w:r>
+      <w:r>
+        <w:rPr>
+          <w:color w:val="333333"/>
+          <w:sz w:val="20"/>
+          <w:szCs w:val="20"/>
+        </w:rPr>
+        <w:t xml:space="preserve"> / </w:t>
+      </w:r>
       <w:hyperlink r:id="rId8">
-        <w:r>
-          <w:rPr>
-            <w:color w:val="333333"/>
-            <w:sz w:val="20"/>
-            <w:szCs w:val="20"/>
-            <w:u w:val="single"/>
-          </w:rPr>
-          <w:t>https://ggv.cl</w:t>
-        </w:r>
-      </w:hyperlink>
-      <w:r>
-        <w:rPr>
-          <w:color w:val="333333"/>
-          <w:sz w:val="20"/>
-          <w:szCs w:val="20"/>
-        </w:rPr>
-        <w:t xml:space="preserve"> / </w:t>
-      </w:r>
-      <w:hyperlink r:id="rId9">
         <w:r>
           <w:rPr>
             <w:color w:val="333333"/>
@@ -101,7 +119,7 @@
         </w:rPr>
         <w:t xml:space="preserve"> / </w:t>
       </w:r>
-      <w:hyperlink r:id="rId10">
+      <w:hyperlink r:id="rId9">
         <w:r>
           <w:rPr>
             <w:color w:val="333333"/>
@@ -120,7 +138,7 @@
         </w:rPr>
         <w:t xml:space="preserve"> / </w:t>
       </w:r>
-      <w:hyperlink r:id="rId11">
+      <w:hyperlink r:id="rId10">
         <w:r>
           <w:rPr>
             <w:color w:val="333333"/>
@@ -1406,7 +1424,6 @@
           <w:sz w:val="20"/>
           <w:szCs w:val="20"/>
         </w:rPr>
-        <w:lastRenderedPageBreak/>
         <w:t xml:space="preserve">MA in Economics and Public Policy, </w:t>
       </w:r>
       <w:r>
@@ -1610,7 +1627,7 @@
         </w:rPr>
         <w:t xml:space="preserve"> (2023). R package version 0.2-1 URL: </w:t>
       </w:r>
-      <w:hyperlink r:id="rId12">
+      <w:hyperlink r:id="rId11">
         <w:r>
           <w:rPr>
             <w:rStyle w:val="Hyperlink"/>
@@ -1661,7 +1678,7 @@
         </w:rPr>
         <w:t xml:space="preserve"> (2020). R package version 0.16.0. URL: </w:t>
       </w:r>
-      <w:hyperlink r:id="rId13">
+      <w:hyperlink r:id="rId12">
         <w:r>
           <w:rPr>
             <w:color w:val="333333"/>
@@ -1712,7 +1729,7 @@
         </w:rPr>
         <w:t xml:space="preserve"> (2020). R package version 1.22.0. URL: </w:t>
       </w:r>
-      <w:hyperlink r:id="rId14">
+      <w:hyperlink r:id="rId13">
         <w:r>
           <w:rPr>
             <w:color w:val="333333"/>
@@ -1763,7 +1780,7 @@
         </w:rPr>
         <w:t xml:space="preserve"> (2020). R package version 0.3-0. URL: </w:t>
       </w:r>
-      <w:hyperlink r:id="rId15">
+      <w:hyperlink r:id="rId14">
         <w:r>
           <w:rPr>
             <w:color w:val="333333"/>
@@ -1836,7 +1853,7 @@
         </w:rPr>
         <w:t xml:space="preserve"> (2020). R package version 0.4-1. URL: </w:t>
       </w:r>
-      <w:hyperlink r:id="rId16">
+      <w:hyperlink r:id="rId15">
         <w:r>
           <w:rPr>
             <w:color w:val="333333"/>
@@ -1877,7 +1894,7 @@
         </w:rPr>
         <w:t xml:space="preserve">fmcmc: A friendly MCMC framework (2020). R package version 0.3-0. URL: </w:t>
       </w:r>
-      <w:hyperlink r:id="rId17">
+      <w:hyperlink r:id="rId16">
         <w:r>
           <w:rPr>
             <w:color w:val="333333"/>
@@ -2000,7 +2017,7 @@
         </w:rPr>
         <w:t xml:space="preserve">: </w:t>
       </w:r>
-      <w:hyperlink r:id="rId18" w:tgtFrame="_new" w:history="1">
+      <w:hyperlink r:id="rId17" w:tgtFrame="_new" w:history="1">
         <w:r>
           <w:rPr>
             <w:color w:val="333333"/>
@@ -2146,7 +2163,7 @@
         </w:rPr>
         <w:t xml:space="preserve"> 64 (2021), pp. 225–238. URL: </w:t>
       </w:r>
-      <w:hyperlink r:id="rId19">
+      <w:hyperlink r:id="rId18">
         <w:r>
           <w:rPr>
             <w:color w:val="333333"/>
@@ -2252,7 +2269,7 @@
         </w:rPr>
         <w:t xml:space="preserve"> 17.2 (Feb. 2021), pp. 1–35. URL: </w:t>
       </w:r>
-      <w:hyperlink r:id="rId20">
+      <w:hyperlink r:id="rId19">
         <w:r>
           <w:rPr>
             <w:color w:val="333333"/>
@@ -2363,7 +2380,7 @@
         </w:rPr>
         <w:t xml:space="preserve"> 4.39 (July 2019), p. 1427. URL: </w:t>
       </w:r>
-      <w:hyperlink r:id="rId21">
+      <w:hyperlink r:id="rId20">
         <w:r>
           <w:rPr>
             <w:color w:val="333333"/>
@@ -2452,7 +2469,7 @@
         </w:rPr>
         <w:t xml:space="preserve"> 19.3 (Sept. 2019), pp. 667–684. URL: </w:t>
       </w:r>
-      <w:hyperlink r:id="rId22">
+      <w:hyperlink r:id="rId21">
         <w:r>
           <w:rPr>
             <w:color w:val="333333"/>
@@ -2803,7 +2820,7 @@
       </w:r>
     </w:p>
     <w:sectPr>
-      <w:footerReference w:type="default" r:id="rId23"/>
+      <w:footerReference w:type="default" r:id="rId22"/>
       <w:pgSz w:w="12240" w:h="15840"/>
       <w:pgMar w:top="720" w:right="720" w:bottom="720" w:left="720" w:header="0" w:footer="0" w:gutter="0"/>
       <w:pgNumType w:start="1"/>

</xml_diff>